<commit_message>
2nd commit of the day
</commit_message>
<xml_diff>
--- a/JavaScript Syntax.docx
+++ b/JavaScript Syntax.docx
@@ -96,14 +96,7 @@
           <w:b/>
           <w:bCs/>
         </w:rPr>
-        <w:t>split(/\s+</w:t>
-      </w:r>
-      <w:r>
-        <w:rPr>
-          <w:b/>
-          <w:bCs/>
-        </w:rPr>
-        <w:t>/</w:t>
+        <w:t>split(/\s+/</w:t>
       </w:r>
       <w:proofErr w:type="gramStart"/>
       <w:r>
@@ -235,7 +228,15 @@
           <w:b/>
           <w:bCs/>
         </w:rPr>
-        <w:t>'.')</w:t>
+        <w:t xml:space="preserve">'.') + </w:t>
+      </w:r>
+      <w:proofErr w:type="gramStart"/>
+      <w:r>
+        <w:rPr>
+          <w:b/>
+          <w:bCs/>
+        </w:rPr>
+        <w:t>‘.’</w:t>
       </w:r>
       <w:r>
         <w:rPr>
@@ -249,23 +250,9 @@
           <w:b/>
           <w:bCs/>
         </w:rPr>
-        <w:t>+</w:t>
-      </w:r>
-      <w:r>
-        <w:rPr>
-          <w:b/>
-          <w:bCs/>
-        </w:rPr>
-        <w:t xml:space="preserve"> ‘.’</w:t>
-      </w:r>
-      <w:proofErr w:type="gramStart"/>
-      <w:r>
-        <w:rPr>
-          <w:b/>
-          <w:bCs/>
-        </w:rPr>
         <w:t>:</w:t>
       </w:r>
+      <w:proofErr w:type="gramEnd"/>
       <w:r>
         <w:t xml:space="preserve">  </w:t>
       </w:r>
@@ -273,14 +260,7 @@
         <w:rPr>
           <w:color w:val="0E2841" w:themeColor="text2"/>
         </w:rPr>
-        <w:t>join</w:t>
-      </w:r>
-      <w:proofErr w:type="gramEnd"/>
-      <w:r>
-        <w:rPr>
-          <w:color w:val="0E2841" w:themeColor="text2"/>
-        </w:rPr>
-        <w:t xml:space="preserve"> the initials with a dot and add a dot at the end.</w:t>
+        <w:t>join the initials with a dot and add a dot at the end.</w:t>
       </w:r>
     </w:p>
     <w:p>
@@ -347,46 +327,20 @@
           <w:bCs/>
           <w:color w:val="0E2841" w:themeColor="text2"/>
         </w:rPr>
-        <w:t>))</w:t>
-      </w:r>
-      <w:r>
-        <w:rPr>
-          <w:b/>
-          <w:bCs/>
-          <w:color w:val="0E2841" w:themeColor="text2"/>
-        </w:rPr>
-        <w:t xml:space="preserve"> </w:t>
-      </w:r>
-      <w:r>
-        <w:rPr>
-          <w:color w:val="0E2841" w:themeColor="text2"/>
-        </w:rPr>
-        <w:t xml:space="preserve"> </w:t>
-      </w:r>
-      <w:r>
-        <w:rPr>
-          <w:color w:val="0E2841" w:themeColor="text2"/>
-        </w:rPr>
-        <w:t>:</w:t>
-      </w:r>
-      <w:proofErr w:type="gramEnd"/>
-      <w:r>
-        <w:rPr>
-          <w:color w:val="0E2841" w:themeColor="text2"/>
-        </w:rPr>
-        <w:t xml:space="preserve"> </w:t>
-      </w:r>
-      <w:r>
-        <w:rPr>
-          <w:color w:val="0E2841" w:themeColor="text2"/>
-        </w:rPr>
-        <w:t xml:space="preserve"> </w:t>
-      </w:r>
-      <w:r>
-        <w:rPr>
-          <w:color w:val="0E2841" w:themeColor="text2"/>
-        </w:rPr>
-        <w:t>Convert the input string to lowercase to ensure case-insensitive comparison</w:t>
+        <w:t xml:space="preserve">)) </w:t>
+      </w:r>
+      <w:r>
+        <w:rPr>
+          <w:color w:val="0E2841" w:themeColor="text2"/>
+        </w:rPr>
+        <w:t xml:space="preserve"> :</w:t>
+      </w:r>
+      <w:proofErr w:type="gramEnd"/>
+      <w:r>
+        <w:rPr>
+          <w:color w:val="0E2841" w:themeColor="text2"/>
+        </w:rPr>
+        <w:t xml:space="preserve">  Convert the input string to lowercase to ensure case-insensitive comparison</w:t>
       </w:r>
     </w:p>
     <w:p>
@@ -556,15 +510,7 @@
           <w:bCs/>
           <w:color w:val="0E2841" w:themeColor="text2"/>
         </w:rPr>
-        <w:t xml:space="preserve"> s === 'string'</w:t>
-      </w:r>
-      <w:r>
-        <w:rPr>
-          <w:b/>
-          <w:bCs/>
-          <w:color w:val="0E2841" w:themeColor="text2"/>
-        </w:rPr>
-        <w:t xml:space="preserve"> </w:t>
+        <w:t xml:space="preserve"> s === 'string' </w:t>
       </w:r>
       <w:proofErr w:type="gramStart"/>
       <w:r>
@@ -582,33 +528,13 @@
           <w:bCs/>
           <w:color w:val="0E2841" w:themeColor="text2"/>
         </w:rPr>
-        <w:t xml:space="preserve"> </w:t>
-      </w:r>
-      <w:r>
-        <w:rPr>
-          <w:b/>
-          <w:bCs/>
-          <w:color w:val="0E2841" w:themeColor="text2"/>
-        </w:rPr>
-        <w:t xml:space="preserve">  </w:t>
-      </w:r>
-      <w:r>
-        <w:rPr>
-          <w:color w:val="0E2841" w:themeColor="text2"/>
-        </w:rPr>
-        <w:t>Ensures the input is a string</w:t>
-      </w:r>
-      <w:r>
-        <w:rPr>
-          <w:color w:val="0E2841" w:themeColor="text2"/>
-        </w:rPr>
-        <w:t>,</w:t>
-      </w:r>
-      <w:r>
-        <w:rPr>
-          <w:color w:val="0E2841" w:themeColor="text2"/>
-        </w:rPr>
-        <w:t xml:space="preserve"> If NOT → return 0 (safe handling)</w:t>
+        <w:t xml:space="preserve">   </w:t>
+      </w:r>
+      <w:r>
+        <w:rPr>
+          <w:color w:val="0E2841" w:themeColor="text2"/>
+        </w:rPr>
+        <w:t>Ensures the input is a string, If NOT → return 0 (safe handling)</w:t>
       </w:r>
     </w:p>
     <w:p>
@@ -968,11 +894,19 @@
         </w:rPr>
         <w:t xml:space="preserve"> </w:t>
       </w:r>
-      <w:r>
-        <w:rPr>
-          <w:color w:val="0E2841" w:themeColor="text2"/>
-        </w:rPr>
-        <w:t>True : value</w:t>
+      <w:proofErr w:type="gramStart"/>
+      <w:r>
+        <w:rPr>
+          <w:color w:val="0E2841" w:themeColor="text2"/>
+        </w:rPr>
+        <w:t>True :</w:t>
+      </w:r>
+      <w:proofErr w:type="gramEnd"/>
+      <w:r>
+        <w:rPr>
+          <w:color w:val="0E2841" w:themeColor="text2"/>
+        </w:rPr>
+        <w:t xml:space="preserve"> value</w:t>
       </w:r>
       <w:r>
         <w:rPr>
@@ -1006,6 +940,400 @@
           <w:ilvl w:val="0"/>
           <w:numId w:val="2"/>
         </w:numPr>
+        <w:rPr>
+          <w:b/>
+          <w:bCs/>
+          <w:color w:val="0E2841" w:themeColor="text2"/>
+        </w:rPr>
+      </w:pPr>
+      <w:proofErr w:type="gramStart"/>
+      <w:r>
+        <w:rPr>
+          <w:b/>
+          <w:bCs/>
+          <w:color w:val="0E2841" w:themeColor="text2"/>
+        </w:rPr>
+        <w:t>for(</w:t>
+      </w:r>
+      <w:proofErr w:type="gramEnd"/>
+      <w:r>
+        <w:rPr>
+          <w:b/>
+          <w:bCs/>
+          <w:color w:val="0E2841" w:themeColor="text2"/>
+        </w:rPr>
+        <w:t xml:space="preserve">const c of </w:t>
+      </w:r>
+      <w:proofErr w:type="gramStart"/>
+      <w:r>
+        <w:rPr>
+          <w:b/>
+          <w:bCs/>
+          <w:color w:val="0E2841" w:themeColor="text2"/>
+        </w:rPr>
+        <w:t>s )</w:t>
+      </w:r>
+      <w:proofErr w:type="gramEnd"/>
+      <w:r>
+        <w:rPr>
+          <w:b/>
+          <w:bCs/>
+          <w:color w:val="0E2841" w:themeColor="text2"/>
+        </w:rPr>
+        <w:t xml:space="preserve"> r </w:t>
+      </w:r>
+      <w:r>
+        <w:rPr>
+          <w:b/>
+          <w:bCs/>
+          <w:color w:val="0E2841" w:themeColor="text2"/>
+        </w:rPr>
+        <w:t xml:space="preserve">+= </w:t>
+      </w:r>
+      <w:proofErr w:type="spellStart"/>
+      <w:proofErr w:type="gramStart"/>
+      <w:r>
+        <w:rPr>
+          <w:b/>
+          <w:bCs/>
+          <w:color w:val="0E2841" w:themeColor="text2"/>
+        </w:rPr>
+        <w:t>c.repeat</w:t>
+      </w:r>
+      <w:proofErr w:type="spellEnd"/>
+      <w:proofErr w:type="gramEnd"/>
+      <w:r>
+        <w:rPr>
+          <w:b/>
+          <w:bCs/>
+          <w:color w:val="0E2841" w:themeColor="text2"/>
+        </w:rPr>
+        <w:t>(n)</w:t>
+      </w:r>
+    </w:p>
+    <w:p>
+      <w:pPr>
+        <w:pStyle w:val="ListParagraph"/>
+        <w:numPr>
+          <w:ilvl w:val="1"/>
+          <w:numId w:val="2"/>
+        </w:numPr>
+        <w:rPr>
+          <w:color w:val="0E2841" w:themeColor="text2"/>
+        </w:rPr>
+      </w:pPr>
+      <w:r>
+        <w:rPr>
+          <w:color w:val="E97132" w:themeColor="accent2"/>
+        </w:rPr>
+        <w:t xml:space="preserve">const c of </w:t>
+      </w:r>
+      <w:proofErr w:type="gramStart"/>
+      <w:r>
+        <w:rPr>
+          <w:color w:val="E97132" w:themeColor="accent2"/>
+        </w:rPr>
+        <w:t xml:space="preserve">s </w:t>
+      </w:r>
+      <w:r>
+        <w:rPr>
+          <w:color w:val="0E2841" w:themeColor="text2"/>
+        </w:rPr>
+        <w:t>:</w:t>
+      </w:r>
+      <w:proofErr w:type="gramEnd"/>
+      <w:r>
+        <w:rPr>
+          <w:color w:val="0E2841" w:themeColor="text2"/>
+        </w:rPr>
+        <w:t xml:space="preserve"> s value </w:t>
+      </w:r>
+      <w:proofErr w:type="gramStart"/>
+      <w:r>
+        <w:rPr>
+          <w:color w:val="0E2841" w:themeColor="text2"/>
+        </w:rPr>
+        <w:t>add</w:t>
+      </w:r>
+      <w:proofErr w:type="gramEnd"/>
+      <w:r>
+        <w:rPr>
+          <w:color w:val="0E2841" w:themeColor="text2"/>
+        </w:rPr>
+        <w:t xml:space="preserve"> to </w:t>
+      </w:r>
+      <w:proofErr w:type="gramStart"/>
+      <w:r>
+        <w:rPr>
+          <w:color w:val="0E2841" w:themeColor="text2"/>
+        </w:rPr>
+        <w:t>c( s</w:t>
+      </w:r>
+      <w:proofErr w:type="gramEnd"/>
+      <w:r>
+        <w:rPr>
+          <w:color w:val="0E2841" w:themeColor="text2"/>
+        </w:rPr>
+        <w:t xml:space="preserve"> value came from function)</w:t>
+      </w:r>
+    </w:p>
+    <w:p>
+      <w:pPr>
+        <w:pStyle w:val="ListParagraph"/>
+        <w:numPr>
+          <w:ilvl w:val="1"/>
+          <w:numId w:val="2"/>
+        </w:numPr>
+        <w:rPr>
+          <w:color w:val="0E2841" w:themeColor="text2"/>
+        </w:rPr>
+      </w:pPr>
+      <w:r>
+        <w:rPr>
+          <w:color w:val="E97132" w:themeColor="accent2"/>
+        </w:rPr>
+        <w:t xml:space="preserve">r += </w:t>
+      </w:r>
+      <w:proofErr w:type="spellStart"/>
+      <w:proofErr w:type="gramStart"/>
+      <w:r>
+        <w:rPr>
+          <w:color w:val="E97132" w:themeColor="accent2"/>
+        </w:rPr>
+        <w:t>c</w:t>
+      </w:r>
+      <w:r>
+        <w:rPr>
+          <w:color w:val="E97132" w:themeColor="accent2"/>
+        </w:rPr>
+        <w:t>.repeat</w:t>
+      </w:r>
+      <w:proofErr w:type="spellEnd"/>
+      <w:proofErr w:type="gramEnd"/>
+      <w:r>
+        <w:rPr>
+          <w:color w:val="E97132" w:themeColor="accent2"/>
+        </w:rPr>
+        <w:t>(n</w:t>
+      </w:r>
+      <w:proofErr w:type="gramStart"/>
+      <w:r>
+        <w:rPr>
+          <w:color w:val="E97132" w:themeColor="accent2"/>
+        </w:rPr>
+        <w:t>)</w:t>
+      </w:r>
+      <w:r>
+        <w:rPr>
+          <w:color w:val="E97132" w:themeColor="accent2"/>
+        </w:rPr>
+        <w:t xml:space="preserve"> </w:t>
+      </w:r>
+      <w:r>
+        <w:rPr>
+          <w:color w:val="0E2841" w:themeColor="text2"/>
+        </w:rPr>
+        <w:t>:</w:t>
+      </w:r>
+      <w:proofErr w:type="gramEnd"/>
+      <w:r>
+        <w:rPr>
+          <w:color w:val="0E2841" w:themeColor="text2"/>
+        </w:rPr>
+        <w:t xml:space="preserve"> this formula repeats n times</w:t>
+      </w:r>
+    </w:p>
+    <w:p>
+      <w:pPr>
+        <w:pStyle w:val="ListParagraph"/>
+        <w:numPr>
+          <w:ilvl w:val="0"/>
+          <w:numId w:val="2"/>
+        </w:numPr>
+        <w:rPr>
+          <w:color w:val="0E2841" w:themeColor="text2"/>
+        </w:rPr>
+      </w:pPr>
+      <w:r>
+        <w:rPr>
+          <w:b/>
+          <w:bCs/>
+          <w:color w:val="0E2841" w:themeColor="text2"/>
+        </w:rPr>
+        <w:t>return ‘$’ + (number/100</w:t>
+      </w:r>
+      <w:proofErr w:type="gramStart"/>
+      <w:r>
+        <w:rPr>
+          <w:b/>
+          <w:bCs/>
+          <w:color w:val="0E2841" w:themeColor="text2"/>
+        </w:rPr>
+        <w:t>).</w:t>
+      </w:r>
+      <w:proofErr w:type="spellStart"/>
+      <w:r>
+        <w:rPr>
+          <w:b/>
+          <w:bCs/>
+          <w:color w:val="0E2841" w:themeColor="text2"/>
+        </w:rPr>
+        <w:t>toFixed</w:t>
+      </w:r>
+      <w:proofErr w:type="spellEnd"/>
+      <w:proofErr w:type="gramEnd"/>
+      <w:r>
+        <w:rPr>
+          <w:b/>
+          <w:bCs/>
+          <w:color w:val="0E2841" w:themeColor="text2"/>
+        </w:rPr>
+        <w:t>(2)</w:t>
+      </w:r>
+      <w:proofErr w:type="gramStart"/>
+      <w:r>
+        <w:rPr>
+          <w:b/>
+          <w:bCs/>
+          <w:color w:val="0E2841" w:themeColor="text2"/>
+        </w:rPr>
+        <w:t>;</w:t>
+      </w:r>
+      <w:r>
+        <w:rPr>
+          <w:color w:val="0E2841" w:themeColor="text2"/>
+        </w:rPr>
+        <w:t xml:space="preserve"> :</w:t>
+      </w:r>
+      <w:proofErr w:type="gramEnd"/>
+      <w:r>
+        <w:rPr>
+          <w:color w:val="0E2841" w:themeColor="text2"/>
+        </w:rPr>
+        <w:t xml:space="preserve"> </w:t>
+      </w:r>
+      <w:r>
+        <w:rPr>
+          <w:color w:val="0E2841" w:themeColor="text2"/>
+        </w:rPr>
+        <w:t xml:space="preserve">Divide the number by 100 to convert cents to </w:t>
+      </w:r>
+      <w:proofErr w:type="gramStart"/>
+      <w:r>
+        <w:rPr>
+          <w:color w:val="0E2841" w:themeColor="text2"/>
+        </w:rPr>
+        <w:t>dollars, and</w:t>
+      </w:r>
+      <w:proofErr w:type="gramEnd"/>
+      <w:r>
+        <w:rPr>
+          <w:color w:val="0E2841" w:themeColor="text2"/>
+        </w:rPr>
+        <w:t xml:space="preserve"> use </w:t>
+      </w:r>
+      <w:proofErr w:type="spellStart"/>
+      <w:proofErr w:type="gramStart"/>
+      <w:r>
+        <w:rPr>
+          <w:color w:val="0E2841" w:themeColor="text2"/>
+        </w:rPr>
+        <w:t>toFixed</w:t>
+      </w:r>
+      <w:proofErr w:type="spellEnd"/>
+      <w:r>
+        <w:rPr>
+          <w:color w:val="0E2841" w:themeColor="text2"/>
+        </w:rPr>
+        <w:t>(</w:t>
+      </w:r>
+      <w:proofErr w:type="gramEnd"/>
+      <w:r>
+        <w:rPr>
+          <w:color w:val="0E2841" w:themeColor="text2"/>
+        </w:rPr>
+        <w:t>2) to format it to 2 decimal places.</w:t>
+      </w:r>
+    </w:p>
+    <w:p>
+      <w:pPr>
+        <w:pStyle w:val="ListParagraph"/>
+        <w:numPr>
+          <w:ilvl w:val="0"/>
+          <w:numId w:val="2"/>
+        </w:numPr>
+        <w:rPr>
+          <w:color w:val="0E2841" w:themeColor="text2"/>
+        </w:rPr>
+      </w:pPr>
+      <w:proofErr w:type="gramStart"/>
+      <w:r>
+        <w:rPr>
+          <w:b/>
+          <w:bCs/>
+          <w:color w:val="0E2841" w:themeColor="text2"/>
+        </w:rPr>
+        <w:t xml:space="preserve">reduce() </w:t>
+      </w:r>
+      <w:r>
+        <w:rPr>
+          <w:b/>
+          <w:bCs/>
+          <w:color w:val="0E2841" w:themeColor="text2"/>
+        </w:rPr>
+        <w:t>:</w:t>
+      </w:r>
+      <w:proofErr w:type="gramEnd"/>
+      <w:r>
+        <w:rPr>
+          <w:b/>
+          <w:bCs/>
+          <w:color w:val="0E2841" w:themeColor="text2"/>
+        </w:rPr>
+        <w:t xml:space="preserve"> </w:t>
+      </w:r>
+      <w:r>
+        <w:rPr>
+          <w:color w:val="0E2841" w:themeColor="text2"/>
+        </w:rPr>
+        <w:t xml:space="preserve">takes an array and reduces it to one </w:t>
+      </w:r>
+      <w:proofErr w:type="gramStart"/>
+      <w:r>
+        <w:rPr>
+          <w:color w:val="0E2841" w:themeColor="text2"/>
+        </w:rPr>
+        <w:t>final result</w:t>
+      </w:r>
+      <w:proofErr w:type="gramEnd"/>
+      <w:r>
+        <w:rPr>
+          <w:color w:val="0E2841" w:themeColor="text2"/>
+        </w:rPr>
+        <w:t xml:space="preserve"> (like a sum, total, or single object).</w:t>
+      </w:r>
+    </w:p>
+    <w:p>
+      <w:pPr>
+        <w:pStyle w:val="ListParagraph"/>
+        <w:numPr>
+          <w:ilvl w:val="0"/>
+          <w:numId w:val="2"/>
+        </w:numPr>
+        <w:rPr>
+          <w:color w:val="0E2841" w:themeColor="text2"/>
+        </w:rPr>
+      </w:pPr>
+    </w:p>
+    <w:p>
+      <w:pPr>
+        <w:rPr>
+          <w:color w:val="0E2841" w:themeColor="text2"/>
+        </w:rPr>
+      </w:pPr>
+    </w:p>
+    <w:p>
+      <w:pPr>
         <w:rPr>
           <w:b/>
           <w:bCs/>
@@ -1185,7 +1513,7 @@
   <w:abstractNum w:abstractNumId="1" w15:restartNumberingAfterBreak="0">
     <w:nsid w:val="6F4E46A3"/>
     <w:multiLevelType w:val="hybridMultilevel"/>
-    <w:tmpl w:val="C2BC41BE"/>
+    <w:tmpl w:val="B59A4750"/>
     <w:lvl w:ilvl="0" w:tplc="04090001">
       <w:start w:val="1"/>
       <w:numFmt w:val="bullet"/>
@@ -1198,7 +1526,7 @@
         <w:rFonts w:ascii="Symbol" w:hAnsi="Symbol" w:hint="default"/>
       </w:rPr>
     </w:lvl>
-    <w:lvl w:ilvl="1" w:tplc="04090003" w:tentative="1">
+    <w:lvl w:ilvl="1" w:tplc="04090003">
       <w:start w:val="1"/>
       <w:numFmt w:val="bullet"/>
       <w:lvlText w:val="o"/>
@@ -2550,6 +2878,21 @@
 </file>
 
 <file path=customXml/item1.xml><?xml version="1.0" encoding="utf-8"?>
+<p:properties xmlns:p="http://schemas.microsoft.com/office/2006/metadata/properties" xmlns:xsi="http://www.w3.org/2001/XMLSchema-instance" xmlns:pc="http://schemas.microsoft.com/office/infopath/2007/PartnerControls">
+  <documentManagement/>
+</p:properties>
+</file>
+
+<file path=customXml/item2.xml><?xml version="1.0" encoding="utf-8"?>
+<?mso-contentType ?>
+<FormTemplates xmlns="http://schemas.microsoft.com/sharepoint/v3/contenttype/forms">
+  <Display>DocumentLibraryForm</Display>
+  <Edit>DocumentLibraryForm</Edit>
+  <New>DocumentLibraryForm</New>
+</FormTemplates>
+</file>
+
+<file path=customXml/item3.xml><?xml version="1.0" encoding="utf-8"?>
 <ct:contentTypeSchema xmlns:ct="http://schemas.microsoft.com/office/2006/metadata/contentType" xmlns:ma="http://schemas.microsoft.com/office/2006/metadata/properties/metaAttributes" ct:_="" ma:_="" ma:contentTypeName="Document" ma:contentTypeID="0x010100C20D6D77A139334BB1753D5BAF40E53B" ma:contentTypeVersion="5" ma:contentTypeDescription="Create a new document." ma:contentTypeScope="" ma:versionID="a53a73a5d76a5f45609bfaacfd9efb38">
   <xsd:schema xmlns:xsd="http://www.w3.org/2001/XMLSchema" xmlns:xs="http://www.w3.org/2001/XMLSchema" xmlns:p="http://schemas.microsoft.com/office/2006/metadata/properties" xmlns:ns3="5d34b39b-1599-49bd-81b1-4f5042c2cb5f" targetNamespace="http://schemas.microsoft.com/office/2006/metadata/properties" ma:root="true" ma:fieldsID="3d44e6975378ecd70ec98e54397c9e3c" ns3:_="">
     <xsd:import namespace="5d34b39b-1599-49bd-81b1-4f5042c2cb5f"/>
@@ -2699,22 +3042,24 @@
 </ct:contentTypeSchema>
 </file>
 
-<file path=customXml/item2.xml><?xml version="1.0" encoding="utf-8"?>
-<?mso-contentType ?>
-<FormTemplates xmlns="http://schemas.microsoft.com/sharepoint/v3/contenttype/forms">
-  <Display>DocumentLibraryForm</Display>
-  <Edit>DocumentLibraryForm</Edit>
-  <New>DocumentLibraryForm</New>
-</FormTemplates>
+<file path=customXml/itemProps1.xml><?xml version="1.0" encoding="utf-8"?>
+<ds:datastoreItem xmlns:ds="http://schemas.openxmlformats.org/officeDocument/2006/customXml" ds:itemID="{BA51B77C-1084-4844-952D-F1DA4F7FEEFA}">
+  <ds:schemaRefs>
+    <ds:schemaRef ds:uri="http://schemas.microsoft.com/office/2006/metadata/properties"/>
+    <ds:schemaRef ds:uri="http://schemas.microsoft.com/office/infopath/2007/PartnerControls"/>
+  </ds:schemaRefs>
+</ds:datastoreItem>
 </file>
 
-<file path=customXml/item3.xml><?xml version="1.0" encoding="utf-8"?>
-<p:properties xmlns:p="http://schemas.microsoft.com/office/2006/metadata/properties" xmlns:xsi="http://www.w3.org/2001/XMLSchema-instance" xmlns:pc="http://schemas.microsoft.com/office/infopath/2007/PartnerControls">
-  <documentManagement/>
-</p:properties>
+<file path=customXml/itemProps2.xml><?xml version="1.0" encoding="utf-8"?>
+<ds:datastoreItem xmlns:ds="http://schemas.openxmlformats.org/officeDocument/2006/customXml" ds:itemID="{9648832E-907C-4CE7-BE64-AAA4B5CD6D89}">
+  <ds:schemaRefs>
+    <ds:schemaRef ds:uri="http://schemas.microsoft.com/sharepoint/v3/contenttype/forms"/>
+  </ds:schemaRefs>
+</ds:datastoreItem>
 </file>
 
-<file path=customXml/itemProps1.xml><?xml version="1.0" encoding="utf-8"?>
+<file path=customXml/itemProps3.xml><?xml version="1.0" encoding="utf-8"?>
 <ds:datastoreItem xmlns:ds="http://schemas.openxmlformats.org/officeDocument/2006/customXml" ds:itemID="{8D1AAC06-0EAF-49A1-9969-48B870117196}">
   <ds:schemaRefs>
     <ds:schemaRef ds:uri="http://schemas.microsoft.com/office/2006/metadata/contentType"/>
@@ -2730,21 +3075,4 @@
     <ds:schemaRef ds:uri="http://schemas.microsoft.com/internal/obd"/>
   </ds:schemaRefs>
 </ds:datastoreItem>
-</file>
-
-<file path=customXml/itemProps2.xml><?xml version="1.0" encoding="utf-8"?>
-<ds:datastoreItem xmlns:ds="http://schemas.openxmlformats.org/officeDocument/2006/customXml" ds:itemID="{9648832E-907C-4CE7-BE64-AAA4B5CD6D89}">
-  <ds:schemaRefs>
-    <ds:schemaRef ds:uri="http://schemas.microsoft.com/sharepoint/v3/contenttype/forms"/>
-  </ds:schemaRefs>
-</ds:datastoreItem>
-</file>
-
-<file path=customXml/itemProps3.xml><?xml version="1.0" encoding="utf-8"?>
-<ds:datastoreItem xmlns:ds="http://schemas.openxmlformats.org/officeDocument/2006/customXml" ds:itemID="{BA51B77C-1084-4844-952D-F1DA4F7FEEFA}">
-  <ds:schemaRefs>
-    <ds:schemaRef ds:uri="http://schemas.microsoft.com/office/2006/metadata/properties"/>
-    <ds:schemaRef ds:uri="http://schemas.microsoft.com/office/infopath/2007/PartnerControls"/>
-  </ds:schemaRefs>
-</ds:datastoreItem>
 </file>
</xml_diff>